<commit_message>
Tag Smoke gets in your mind as recreation
Co-Authored-By: Claude Sonnet 5.5 <noreply@anthropic.com>
</commit_message>
<xml_diff>
--- a/content-src/docx/R TLS 1999 12 10 Smoking Book.docx
+++ b/content-src/docx/R TLS 1999 12 10 Smoking Book.docx
@@ -37,6 +37,11 @@
     </w:p>
     <w:p>
       <w:r>
+        <w:t>&lt;category&gt;recreation&lt;/category&gt;</w:t>
+      </w:r>
+    </w:p>
+    <w:p>
+      <w:r>
         <w:t xml:space="preserve">Addiction does not have a narrative; it is cyclical, interminable. "Giving up" doesn't have a narrative either; it comes flooded with pain and loss, over and over, and the same possibility that "giving up" might end at any moment. This was the triumph of Irvine Welsh's Trainspotting, and its episodic, picaresque feel; there was only a small continuity to its chapters, because by and large they rehearsed the same two states of being: using heroin, and not using heroin. People who have never smoked do not spend their lives not-smoking; they live. People who have given up smoking do spend their lives not-smoking. Everything they do is overlaid by an awareness of what they are not doing.</w:t>
       </w:r>
     </w:p>

</xml_diff>